<commit_message>
feat: standardize Carbon Aerogel SOP (no bleaching) & reorganize operational scripts
</commit_message>
<xml_diff>
--- a/1 SOPs/new/OUTLINE_THONG_SO_TONG_HOP_CA.docx
+++ b/1 SOPs/new/OUTLINE_THONG_SO_TONG_HOP_CA.docx
@@ -2665,7 +2665,7 @@
               <w:rPr>
                 <w:sz w:val="20"/>
               </w:rPr>
-              <w:t>Tay trang (tuy chon)</w:t>
+              <w:t>Can khoi luong</w:t>
             </w:r>
           </w:p>
         </w:tc>
@@ -2679,60 +2679,13 @@
               <w:rPr>
                 <w:sz w:val="20"/>
               </w:rPr>
-              <w:t>10% H2O2 + 3% NaOH (1:1), 1g:20mL, 80C, 1h x 2</w:t>
+              <w:t>Say 105C, can truoc/sau kiem hoa</w:t>
             </w:r>
           </w:p>
         </w:tc>
         <w:tc>
           <w:tcPr>
             <w:tcW w:type="dxa" w:w="3685"/>
-          </w:tcPr>
-          <w:p>
-            <w:r/>
-            <w:r>
-              <w:rPr>
-                <w:sz w:val="20"/>
-              </w:rPr>
-              <w:t>Loai lignin tan du. Co the bo qua</w:t>
-            </w:r>
-          </w:p>
-        </w:tc>
-      </w:tr>
-      <w:tr>
-        <w:tc>
-          <w:tcPr>
-            <w:tcW w:type="dxa" w:w="1984"/>
-            <w:shd w:fill="E8F0FE"/>
-          </w:tcPr>
-          <w:p>
-            <w:r/>
-            <w:r>
-              <w:rPr>
-                <w:sz w:val="20"/>
-              </w:rPr>
-              <w:t>Can khoi luong</w:t>
-            </w:r>
-          </w:p>
-        </w:tc>
-        <w:tc>
-          <w:tcPr>
-            <w:tcW w:type="dxa" w:w="3969"/>
-            <w:shd w:fill="E8F0FE"/>
-          </w:tcPr>
-          <w:p>
-            <w:r/>
-            <w:r>
-              <w:rPr>
-                <w:sz w:val="20"/>
-              </w:rPr>
-              <w:t>Say 105C, can truoc/sau kiem hoa</w:t>
-            </w:r>
-          </w:p>
-        </w:tc>
-        <w:tc>
-          <w:tcPr>
-            <w:tcW w:type="dxa" w:w="3685"/>
-            <w:shd w:fill="E8F0FE"/>
           </w:tcPr>
           <w:p>
             <w:r/>

</xml_diff>